<commit_message>
Corrige el repositorio y la URL de produccion en los documentos
</commit_message>
<xml_diff>
--- a/docs/Documento_Requerimientos_ImportaChina.docx
+++ b/docs/Documento_Requerimientos_ImportaChina.docx
@@ -261,7 +261,7 @@
           </w:tcPr>
           <w:p>
             <w:r>
-              <w:t>github.com/antoavila97/importachina</w:t>
+              <w:t>github.com/zabalapereiraa1-ui/importachina</w:t>
             </w:r>
           </w:p>
         </w:tc>
@@ -290,7 +290,7 @@
           </w:tcPr>
           <w:p>
             <w:r>
-              <w:t>importachina-production.up.railway.app</w:t>
+              <w:t>importachina.onrender.com</w:t>
             </w:r>
           </w:p>
         </w:tc>
@@ -1559,7 +1559,7 @@
               <w:rPr>
                 <w:sz w:val="20"/>
               </w:rPr>
-              <w:t>Railway (contenedor con MySQL administrado)</w:t>
+              <w:t>Render (contenedor Docker con TiDB Cloud, compatible con MySQL)</w:t>
             </w:r>
           </w:p>
         </w:tc>
@@ -11570,7 +11570,7 @@
               <w:rPr>
                 <w:sz w:val="20"/>
               </w:rPr>
-              <w:t>https://importachina-production.up.railway.app</w:t>
+              <w:t>https://importachina.onrender.com</w:t>
             </w:r>
           </w:p>
         </w:tc>

</xml_diff>